<commit_message>
docs(pr12): mark report table headers for accessibility
</commit_message>
<xml_diff>
--- a/docs/labs/pr12/ds/reports/0104-pz02-ds.docx
+++ b/docs/labs/pr12/ds/reports/0104-pz02-ds.docx
@@ -58,6 +58,9 @@
         <w:gridCol w:w="3312"/>
       </w:tblGrid>
       <w:tr>
+        <w:trPr>
+          <w:tblHeader w:val="true"/>
+        </w:trPr>
         <w:tc>
           <w:tcPr>
             <w:tcW w:type="dxa" w:w="1728"/>
@@ -471,6 +474,9 @@
         <w:gridCol w:w="3312"/>
       </w:tblGrid>
       <w:tr>
+        <w:trPr>
+          <w:tblHeader w:val="true"/>
+        </w:trPr>
         <w:tc>
           <w:tcPr>
             <w:tcW w:type="dxa" w:w="2016"/>

</xml_diff>